<commit_message>
Blog: add generalizability caveats to key takeaway 5 and Tanzania contrast paragraph
</commit_message>
<xml_diff>
--- a/blog/blog_S2P_final.docx
+++ b/blog/blog_S2P_final.docx
@@ -210,13 +210,13 @@
         </w:numPr>
       </w:pPr>
       <w:r>
-        <w:t>These results challenge the assumption that upgrading the information link of the agricultural value chain is sufficient to induce precision input use</w:t>
+        <w:t>These results — from a context where a long-running subsidy programme has shaped farmer expectations around a specific input bundle — challenge the assumption that upgrading the information link alone is sufficient to induce precision input use</w:t>
       </w:r>
       <w:r>
         <w:t xml:space="preserve">, </w:t>
       </w:r>
       <w:r>
-        <w:t>a caveat that extends to AI-powered digital advisory tools.</w:t>
+        <w:t>a caveat worth bearing in mind for AI-powered digital advisory tools deployed in similar settings.</w:t>
       </w:r>
     </w:p>
     <w:p>
@@ -594,7 +594,7 @@
         </w:r>
       </w:hyperlink>
       <w:r>
-        <w:t xml:space="preserve"> found that the bundle shifted half of farmers toward the soil-test-prescribed product (ammonium sulfate, the relevant input where soils were sulfur-deficient), compared with only 4% of farmers in the voucher-only arm. Our Malawian voucher arm does not produce a comparable shift in product choice.</w:t>
+        <w:t xml:space="preserve"> found that the bundle shifted half of farmers toward the soil-test-prescribed product (ammonium sulfate, the relevant input where soils were sulfur-deficient), compared with only 4% of farmers in the voucher-only arm. Our Malawian voucher arm does not produce a comparable shift in product choice. The contrast suggests the failure to shift product mix may reflect something specific to the Malawi context — most likely the strong expectations built up around the AIP bundle — rather than a universal property of voucher-plus-recommendation interventions.</w:t>
       </w:r>
     </w:p>
     <w:p>

</xml_diff>